<commit_message>
Correct description of LSE 2024 authority-allocation thesis (it covers the regional level)
Co-Authored-By: Claude Opus 5.5 <noreply@anthropic.com>
Claude-Session: https://claude.ai/code/session_01BnDdAUrtzJjncTeLMaQmJh
</commit_message>
<xml_diff>
--- a/期刊梳理_2024-2026/海外博士论文前沿方向报告.docx
+++ b/期刊梳理_2024-2026/海外博士论文前沿方向报告.docx
@@ -1589,7 +1589,7 @@
           <w:b w:val="0"/>
           <w:sz w:val="22"/>
         </w:rPr>
-        <w:t>用专家调查测量现实配置偏离最优的程度。</w:t>
+        <w:t>用专家调查（向885位学者发放，回收75份有效问卷，覆盖30种公共产品）测量现实配置偏离最优的程度，结论是多数公共产品应上移至更高层级，并应加强区域机构的作用；政治冲突与供给复杂性是造成偏差的主要因素。</w:t>
       </w:r>
     </w:p>
     <w:p>
@@ -1644,7 +1644,7 @@
           <w:b/>
           <w:sz w:val="22"/>
         </w:rPr>
-        <w:t>把“区域”作为独立层级加入</w:t>
+        <w:t>深化“区域”层的解释</w:t>
       </w:r>
       <w:r>
         <w:rPr>
@@ -1652,7 +1652,7 @@
           <w:b w:val="0"/>
           <w:sz w:val="22"/>
         </w:rPr>
-        <w:t>：该论文以全球与国家两层为主，区域层与“区域间”层是你的区域国别学优势；</w:t>
+        <w:t>：该论文已涉及区域层，并得出“应加强区域机构作用”的规范结论，但其依据是专家打分与效率标准。你可以转向解释：区域层为何在某些议题上被选择、在另一些议题上被绕开，以及区域内部结构（主导国、制度密度、认同）如何影响这一选择。这需要区域国别学的在地知识；</w:t>
       </w:r>
     </w:p>
     <w:p>

</xml_diff>